<commit_message>
To Complete Trouble Ticket integration and implementation
</commit_message>
<xml_diff>
--- a/document/Trouble Ticket Overview/touble_ticket.docx
+++ b/document/Trouble Ticket Overview/touble_ticket.docx
@@ -6,17 +6,27 @@
       <w:r>
         <w:t xml:space="preserve">TT </w:t>
       </w:r>
+      <w:proofErr w:type="gramStart"/>
       <w:r>
         <w:t>O</w:t>
       </w:r>
       <w:r>
-        <w:t>pen : 1</w:t>
-      </w:r>
-    </w:p>
-    <w:p>
-      <w:r>
-        <w:t>TT Closed :</w:t>
-      </w:r>
+        <w:t>pen :</w:t>
+      </w:r>
+      <w:proofErr w:type="gramEnd"/>
+      <w:r>
+        <w:t xml:space="preserve"> 1</w:t>
+      </w:r>
+    </w:p>
+    <w:p>
+      <w:r>
+        <w:t xml:space="preserve">TT </w:t>
+      </w:r>
+      <w:proofErr w:type="gramStart"/>
+      <w:r>
+        <w:t>Closed :</w:t>
+      </w:r>
+      <w:proofErr w:type="gramEnd"/>
       <w:r>
         <w:t xml:space="preserve"> </w:t>
       </w:r>
@@ -24,9 +34,11 @@
         <w:t>0</w:t>
       </w:r>
     </w:p>
-    <w:p/>
-    <w:p>
-      <w:r>
+    <w:p>
+      <w:r>
+        <w:rPr>
+          <w:noProof/>
+        </w:rPr>
         <w:drawing>
           <wp:inline distT="0" distB="0" distL="0" distR="0" wp14:anchorId="20C5BF07" wp14:editId="10143E09">
             <wp:extent cx="5943600" cy="3346450"/>
@@ -62,6 +74,641 @@
             </a:graphic>
           </wp:inline>
         </w:drawing>
+      </w:r>
+    </w:p>
+    <w:p/>
+    <w:p>
+      <w:r>
+        <w:t>SELECT</w:t>
+      </w:r>
+    </w:p>
+    <w:p>
+      <w:r>
+        <w:t xml:space="preserve">    id,</w:t>
+      </w:r>
+    </w:p>
+    <w:p>
+      <w:r>
+        <w:t xml:space="preserve">    </w:t>
+      </w:r>
+      <w:proofErr w:type="spellStart"/>
+      <w:r>
+        <w:t>tt_no</w:t>
+      </w:r>
+      <w:proofErr w:type="spellEnd"/>
+      <w:r>
+        <w:t>,</w:t>
+      </w:r>
+    </w:p>
+    <w:p>
+      <w:r>
+        <w:t xml:space="preserve">    </w:t>
+      </w:r>
+      <w:proofErr w:type="spellStart"/>
+      <w:r>
+        <w:t>employee_name</w:t>
+      </w:r>
+      <w:proofErr w:type="spellEnd"/>
+      <w:r>
+        <w:t>,</w:t>
+      </w:r>
+    </w:p>
+    <w:p>
+      <w:r>
+        <w:t xml:space="preserve">    </w:t>
+      </w:r>
+      <w:proofErr w:type="spellStart"/>
+      <w:r>
+        <w:t>query_type</w:t>
+      </w:r>
+      <w:proofErr w:type="spellEnd"/>
+      <w:r>
+        <w:t>,</w:t>
+      </w:r>
+    </w:p>
+    <w:p>
+      <w:r>
+        <w:t xml:space="preserve">    status,</w:t>
+      </w:r>
+    </w:p>
+    <w:p>
+      <w:r>
+        <w:t xml:space="preserve">    </w:t>
+      </w:r>
+      <w:proofErr w:type="spellStart"/>
+      <w:r>
+        <w:t>created_at</w:t>
+      </w:r>
+      <w:proofErr w:type="spellEnd"/>
+      <w:r>
+        <w:t>,</w:t>
+      </w:r>
+    </w:p>
+    <w:p>
+      <w:r>
+        <w:t xml:space="preserve">    </w:t>
+      </w:r>
+      <w:proofErr w:type="spellStart"/>
+      <w:r>
+        <w:t>age_seconds</w:t>
+      </w:r>
+      <w:proofErr w:type="spellEnd"/>
+    </w:p>
+    <w:p>
+      <w:r>
+        <w:t xml:space="preserve">FROM </w:t>
+      </w:r>
+      <w:proofErr w:type="spellStart"/>
+      <w:proofErr w:type="gramStart"/>
+      <w:r>
+        <w:t>public.v</w:t>
+      </w:r>
+      <w:proofErr w:type="gramEnd"/>
+      <w:r>
+        <w:t>_trouble_ticket_dashboard</w:t>
+      </w:r>
+      <w:proofErr w:type="spellEnd"/>
+    </w:p>
+    <w:p>
+      <w:r>
+        <w:t xml:space="preserve">ORDER BY </w:t>
+      </w:r>
+      <w:proofErr w:type="spellStart"/>
+      <w:r>
+        <w:t>created_at</w:t>
+      </w:r>
+      <w:proofErr w:type="spellEnd"/>
+      <w:r>
+        <w:t xml:space="preserve"> DESC, id DESC</w:t>
+      </w:r>
+    </w:p>
+    <w:p>
+      <w:r>
+        <w:t>LIMIT 20;</w:t>
+      </w:r>
+    </w:p>
+    <w:p/>
+    <w:p/>
+    <w:p/>
+    <w:p>
+      <w:r>
+        <w:rPr>
+          <w:noProof/>
+        </w:rPr>
+        <w:drawing>
+          <wp:inline distT="0" distB="0" distL="0" distR="0" wp14:anchorId="77E3271F" wp14:editId="46FDA058">
+            <wp:extent cx="5943600" cy="3166110"/>
+            <wp:effectExtent l="0" t="0" r="0" b="0"/>
+            <wp:docPr id="340020765" name="Picture 1"/>
+            <wp:cNvGraphicFramePr>
+              <a:graphicFrameLocks xmlns:a="http://schemas.openxmlformats.org/drawingml/2006/main" noChangeAspect="1"/>
+            </wp:cNvGraphicFramePr>
+            <a:graphic xmlns:a="http://schemas.openxmlformats.org/drawingml/2006/main">
+              <a:graphicData uri="http://schemas.openxmlformats.org/drawingml/2006/picture">
+                <pic:pic xmlns:pic="http://schemas.openxmlformats.org/drawingml/2006/picture">
+                  <pic:nvPicPr>
+                    <pic:cNvPr id="340020765" name=""/>
+                    <pic:cNvPicPr/>
+                  </pic:nvPicPr>
+                  <pic:blipFill>
+                    <a:blip r:embed="rId5"/>
+                    <a:stretch>
+                      <a:fillRect/>
+                    </a:stretch>
+                  </pic:blipFill>
+                  <pic:spPr>
+                    <a:xfrm>
+                      <a:off x="0" y="0"/>
+                      <a:ext cx="5943600" cy="3166110"/>
+                    </a:xfrm>
+                    <a:prstGeom prst="rect">
+                      <a:avLst/>
+                    </a:prstGeom>
+                  </pic:spPr>
+                </pic:pic>
+              </a:graphicData>
+            </a:graphic>
+          </wp:inline>
+        </w:drawing>
+      </w:r>
+    </w:p>
+    <w:p/>
+    <w:p/>
+    <w:p/>
+    <w:p/>
+    <w:p/>
+    <w:p/>
+    <w:p/>
+    <w:p/>
+    <w:p/>
+    <w:p/>
+    <w:p/>
+    <w:p/>
+    <w:p/>
+    <w:p/>
+    <w:p>
+      <w:r>
+        <w:t>SELECT</w:t>
+      </w:r>
+    </w:p>
+    <w:p>
+      <w:r>
+        <w:t xml:space="preserve">    (SELECT </w:t>
+      </w:r>
+      <w:proofErr w:type="gramStart"/>
+      <w:r>
+        <w:t>COUNT(</w:t>
+      </w:r>
+      <w:proofErr w:type="gramEnd"/>
+      <w:r>
+        <w:t>*)</w:t>
+      </w:r>
+    </w:p>
+    <w:p>
+      <w:r>
+        <w:t xml:space="preserve">     FROM </w:t>
+      </w:r>
+      <w:proofErr w:type="spellStart"/>
+      <w:proofErr w:type="gramStart"/>
+      <w:r>
+        <w:t>public.trouble</w:t>
+      </w:r>
+      <w:proofErr w:type="gramEnd"/>
+      <w:r>
+        <w:t>_tickets</w:t>
+      </w:r>
+      <w:proofErr w:type="spellEnd"/>
+      <w:r>
+        <w:t xml:space="preserve">) AS </w:t>
+      </w:r>
+      <w:proofErr w:type="spellStart"/>
+      <w:r>
+        <w:t>total_tickets</w:t>
+      </w:r>
+      <w:proofErr w:type="spellEnd"/>
+      <w:r>
+        <w:t>,</w:t>
+      </w:r>
+    </w:p>
+    <w:p/>
+    <w:p>
+      <w:r>
+        <w:t xml:space="preserve">    (SELECT </w:t>
+      </w:r>
+      <w:proofErr w:type="gramStart"/>
+      <w:r>
+        <w:t>COUNT(</w:t>
+      </w:r>
+      <w:proofErr w:type="gramEnd"/>
+      <w:r>
+        <w:t>*)</w:t>
+      </w:r>
+    </w:p>
+    <w:p>
+      <w:r>
+        <w:t xml:space="preserve">     FROM </w:t>
+      </w:r>
+      <w:proofErr w:type="spellStart"/>
+      <w:proofErr w:type="gramStart"/>
+      <w:r>
+        <w:t>public.trouble</w:t>
+      </w:r>
+      <w:proofErr w:type="gramEnd"/>
+      <w:r>
+        <w:t>_ticket_history</w:t>
+      </w:r>
+      <w:proofErr w:type="spellEnd"/>
+      <w:r>
+        <w:t xml:space="preserve">) AS </w:t>
+      </w:r>
+      <w:proofErr w:type="spellStart"/>
+      <w:r>
+        <w:t>total_history</w:t>
+      </w:r>
+      <w:proofErr w:type="spellEnd"/>
+      <w:r>
+        <w:t>;</w:t>
+      </w:r>
+    </w:p>
+    <w:p/>
+    <w:p/>
+    <w:p>
+      <w:r>
+        <w:rPr>
+          <w:noProof/>
+        </w:rPr>
+        <w:drawing>
+          <wp:inline distT="0" distB="0" distL="0" distR="0" wp14:anchorId="407B41BF" wp14:editId="2E3EC552">
+            <wp:extent cx="5943600" cy="3181350"/>
+            <wp:effectExtent l="0" t="0" r="0" b="0"/>
+            <wp:docPr id="32109180" name="Picture 1"/>
+            <wp:cNvGraphicFramePr>
+              <a:graphicFrameLocks xmlns:a="http://schemas.openxmlformats.org/drawingml/2006/main" noChangeAspect="1"/>
+            </wp:cNvGraphicFramePr>
+            <a:graphic xmlns:a="http://schemas.openxmlformats.org/drawingml/2006/main">
+              <a:graphicData uri="http://schemas.openxmlformats.org/drawingml/2006/picture">
+                <pic:pic xmlns:pic="http://schemas.openxmlformats.org/drawingml/2006/picture">
+                  <pic:nvPicPr>
+                    <pic:cNvPr id="32109180" name=""/>
+                    <pic:cNvPicPr/>
+                  </pic:nvPicPr>
+                  <pic:blipFill>
+                    <a:blip r:embed="rId6"/>
+                    <a:stretch>
+                      <a:fillRect/>
+                    </a:stretch>
+                  </pic:blipFill>
+                  <pic:spPr>
+                    <a:xfrm>
+                      <a:off x="0" y="0"/>
+                      <a:ext cx="5943600" cy="3181350"/>
+                    </a:xfrm>
+                    <a:prstGeom prst="rect">
+                      <a:avLst/>
+                    </a:prstGeom>
+                  </pic:spPr>
+                </pic:pic>
+              </a:graphicData>
+            </a:graphic>
+          </wp:inline>
+        </w:drawing>
+      </w:r>
+    </w:p>
+    <w:p/>
+    <w:p/>
+    <w:p/>
+    <w:p/>
+    <w:p/>
+    <w:p/>
+    <w:p/>
+    <w:p>
+      <w:r>
+        <w:t>SELECT</w:t>
+      </w:r>
+    </w:p>
+    <w:p>
+      <w:r>
+        <w:t xml:space="preserve">    </w:t>
+      </w:r>
+      <w:proofErr w:type="gramStart"/>
+      <w:r>
+        <w:t>MIN(</w:t>
+      </w:r>
+      <w:proofErr w:type="spellStart"/>
+      <w:proofErr w:type="gramEnd"/>
+      <w:r>
+        <w:t>created_at</w:t>
+      </w:r>
+      <w:proofErr w:type="spellEnd"/>
+      <w:r>
+        <w:t xml:space="preserve">) AS </w:t>
+      </w:r>
+      <w:proofErr w:type="spellStart"/>
+      <w:r>
+        <w:t>first_ticket</w:t>
+      </w:r>
+      <w:proofErr w:type="spellEnd"/>
+      <w:r>
+        <w:t>,</w:t>
+      </w:r>
+    </w:p>
+    <w:p>
+      <w:r>
+        <w:t xml:space="preserve">    </w:t>
+      </w:r>
+      <w:proofErr w:type="gramStart"/>
+      <w:r>
+        <w:t>MAX(</w:t>
+      </w:r>
+      <w:proofErr w:type="spellStart"/>
+      <w:proofErr w:type="gramEnd"/>
+      <w:r>
+        <w:t>created_at</w:t>
+      </w:r>
+      <w:proofErr w:type="spellEnd"/>
+      <w:r>
+        <w:t xml:space="preserve">) AS </w:t>
+      </w:r>
+      <w:proofErr w:type="spellStart"/>
+      <w:r>
+        <w:t>latest_ticket</w:t>
+      </w:r>
+      <w:proofErr w:type="spellEnd"/>
+    </w:p>
+    <w:p>
+      <w:r>
+        <w:t xml:space="preserve">FROM </w:t>
+      </w:r>
+      <w:proofErr w:type="spellStart"/>
+      <w:proofErr w:type="gramStart"/>
+      <w:r>
+        <w:t>public.trouble</w:t>
+      </w:r>
+      <w:proofErr w:type="gramEnd"/>
+      <w:r>
+        <w:t>_tickets</w:t>
+      </w:r>
+      <w:proofErr w:type="spellEnd"/>
+      <w:r>
+        <w:t>;</w:t>
+      </w:r>
+    </w:p>
+    <w:p/>
+    <w:p/>
+    <w:p>
+      <w:r>
+        <w:rPr>
+          <w:noProof/>
+        </w:rPr>
+        <w:drawing>
+          <wp:inline distT="0" distB="0" distL="0" distR="0" wp14:anchorId="25F12CFD" wp14:editId="4C6A4180">
+            <wp:extent cx="5943600" cy="3184525"/>
+            <wp:effectExtent l="0" t="0" r="0" b="0"/>
+            <wp:docPr id="1314437151" name="Picture 1"/>
+            <wp:cNvGraphicFramePr>
+              <a:graphicFrameLocks xmlns:a="http://schemas.openxmlformats.org/drawingml/2006/main" noChangeAspect="1"/>
+            </wp:cNvGraphicFramePr>
+            <a:graphic xmlns:a="http://schemas.openxmlformats.org/drawingml/2006/main">
+              <a:graphicData uri="http://schemas.openxmlformats.org/drawingml/2006/picture">
+                <pic:pic xmlns:pic="http://schemas.openxmlformats.org/drawingml/2006/picture">
+                  <pic:nvPicPr>
+                    <pic:cNvPr id="1314437151" name=""/>
+                    <pic:cNvPicPr/>
+                  </pic:nvPicPr>
+                  <pic:blipFill>
+                    <a:blip r:embed="rId7"/>
+                    <a:stretch>
+                      <a:fillRect/>
+                    </a:stretch>
+                  </pic:blipFill>
+                  <pic:spPr>
+                    <a:xfrm>
+                      <a:off x="0" y="0"/>
+                      <a:ext cx="5943600" cy="3184525"/>
+                    </a:xfrm>
+                    <a:prstGeom prst="rect">
+                      <a:avLst/>
+                    </a:prstGeom>
+                  </pic:spPr>
+                </pic:pic>
+              </a:graphicData>
+            </a:graphic>
+          </wp:inline>
+        </w:drawing>
+      </w:r>
+    </w:p>
+    <w:p/>
+    <w:p>
+      <w:r>
+        <w:t>The current incomplete export should show the latest master ticket around:</w:t>
+      </w:r>
+    </w:p>
+    <w:p>
+      <w:r>
+        <w:t>2020-01-08</w:t>
+      </w:r>
+    </w:p>
+    <w:p/>
+    <w:p/>
+    <w:p/>
+    <w:p/>
+    <w:p/>
+    <w:p/>
+    <w:p/>
+    <w:p>
+      <w:r>
+        <w:t>SELECT</w:t>
+      </w:r>
+    </w:p>
+    <w:p>
+      <w:r>
+        <w:t xml:space="preserve">    status,</w:t>
+      </w:r>
+    </w:p>
+    <w:p>
+      <w:r>
+        <w:t xml:space="preserve">    </w:t>
+      </w:r>
+      <w:proofErr w:type="gramStart"/>
+      <w:r>
+        <w:t>COUNT(</w:t>
+      </w:r>
+      <w:proofErr w:type="gramEnd"/>
+      <w:r>
+        <w:t>*) AS total</w:t>
+      </w:r>
+    </w:p>
+    <w:p>
+      <w:r>
+        <w:t xml:space="preserve">FROM </w:t>
+      </w:r>
+      <w:proofErr w:type="spellStart"/>
+      <w:proofErr w:type="gramStart"/>
+      <w:r>
+        <w:t>public.trouble</w:t>
+      </w:r>
+      <w:proofErr w:type="gramEnd"/>
+      <w:r>
+        <w:t>_tickets</w:t>
+      </w:r>
+      <w:proofErr w:type="spellEnd"/>
+    </w:p>
+    <w:p>
+      <w:r>
+        <w:t>GROUP BY status</w:t>
+      </w:r>
+    </w:p>
+    <w:p>
+      <w:r>
+        <w:t>ORDER BY status;</w:t>
+      </w:r>
+    </w:p>
+    <w:p/>
+    <w:p>
+      <w:r>
+        <w:rPr>
+          <w:noProof/>
+        </w:rPr>
+        <w:drawing>
+          <wp:inline distT="0" distB="0" distL="0" distR="0" wp14:anchorId="75582F49" wp14:editId="1CC0A209">
+            <wp:extent cx="5943600" cy="3187700"/>
+            <wp:effectExtent l="0" t="0" r="0" b="0"/>
+            <wp:docPr id="1380006552" name="Picture 1"/>
+            <wp:cNvGraphicFramePr>
+              <a:graphicFrameLocks xmlns:a="http://schemas.openxmlformats.org/drawingml/2006/main" noChangeAspect="1"/>
+            </wp:cNvGraphicFramePr>
+            <a:graphic xmlns:a="http://schemas.openxmlformats.org/drawingml/2006/main">
+              <a:graphicData uri="http://schemas.openxmlformats.org/drawingml/2006/picture">
+                <pic:pic xmlns:pic="http://schemas.openxmlformats.org/drawingml/2006/picture">
+                  <pic:nvPicPr>
+                    <pic:cNvPr id="1380006552" name=""/>
+                    <pic:cNvPicPr/>
+                  </pic:nvPicPr>
+                  <pic:blipFill>
+                    <a:blip r:embed="rId8"/>
+                    <a:stretch>
+                      <a:fillRect/>
+                    </a:stretch>
+                  </pic:blipFill>
+                  <pic:spPr>
+                    <a:xfrm>
+                      <a:off x="0" y="0"/>
+                      <a:ext cx="5943600" cy="3187700"/>
+                    </a:xfrm>
+                    <a:prstGeom prst="rect">
+                      <a:avLst/>
+                    </a:prstGeom>
+                  </pic:spPr>
+                </pic:pic>
+              </a:graphicData>
+            </a:graphic>
+          </wp:inline>
+        </w:drawing>
+      </w:r>
+    </w:p>
+    <w:p/>
+    <w:p/>
+    <w:p/>
+    <w:p/>
+    <w:p/>
+    <w:p/>
+    <w:p/>
+    <w:p/>
+    <w:p>
+      <w:r>
+        <w:t>SELECT</w:t>
+      </w:r>
+    </w:p>
+    <w:p>
+      <w:r>
+        <w:t xml:space="preserve">    (</w:t>
+      </w:r>
+    </w:p>
+    <w:p>
+      <w:r>
+        <w:t xml:space="preserve">        SELECT </w:t>
+      </w:r>
+      <w:proofErr w:type="gramStart"/>
+      <w:r>
+        <w:t>COUNT(</w:t>
+      </w:r>
+      <w:proofErr w:type="gramEnd"/>
+      <w:r>
+        <w:t>*)</w:t>
+      </w:r>
+    </w:p>
+    <w:p>
+      <w:r>
+        <w:t xml:space="preserve">        FROM </w:t>
+      </w:r>
+      <w:proofErr w:type="spellStart"/>
+      <w:proofErr w:type="gramStart"/>
+      <w:r>
+        <w:t>public.trouble</w:t>
+      </w:r>
+      <w:proofErr w:type="gramEnd"/>
+      <w:r>
+        <w:t>_tickets</w:t>
+      </w:r>
+      <w:proofErr w:type="spellEnd"/>
+    </w:p>
+    <w:p>
+      <w:r>
+        <w:t xml:space="preserve">    ) AS </w:t>
+      </w:r>
+      <w:proofErr w:type="spellStart"/>
+      <w:r>
+        <w:t>total_tickets</w:t>
+      </w:r>
+      <w:proofErr w:type="spellEnd"/>
+      <w:r>
+        <w:t>,</w:t>
+      </w:r>
+    </w:p>
+    <w:p>
+      <w:r>
+        <w:t xml:space="preserve">    (</w:t>
+      </w:r>
+    </w:p>
+    <w:p>
+      <w:r>
+        <w:t xml:space="preserve">        SELECT </w:t>
+      </w:r>
+      <w:proofErr w:type="gramStart"/>
+      <w:r>
+        <w:t>COUNT(</w:t>
+      </w:r>
+      <w:proofErr w:type="gramEnd"/>
+      <w:r>
+        <w:t>*)</w:t>
+      </w:r>
+    </w:p>
+    <w:p>
+      <w:r>
+        <w:t xml:space="preserve">        FROM </w:t>
+      </w:r>
+      <w:proofErr w:type="spellStart"/>
+      <w:proofErr w:type="gramStart"/>
+      <w:r>
+        <w:t>public.trouble</w:t>
+      </w:r>
+      <w:proofErr w:type="gramEnd"/>
+      <w:r>
+        <w:t>_ticket_history</w:t>
+      </w:r>
+      <w:proofErr w:type="spellEnd"/>
+    </w:p>
+    <w:p>
+      <w:r>
+        <w:t xml:space="preserve">    ) AS </w:t>
+      </w:r>
+      <w:proofErr w:type="spellStart"/>
+      <w:r>
+        <w:t>total_history</w:t>
+      </w:r>
+      <w:proofErr w:type="spellEnd"/>
+      <w:r>
+        <w:t>;</w:t>
       </w:r>
     </w:p>
     <w:sectPr>

</xml_diff>